<commit_message>
Practica 10 JMMCH y AMH Corregida
</commit_message>
<xml_diff>
--- a/Actividades capitulo 10_AMH_JMMCH.docx
+++ b/Actividades capitulo 10_AMH_JMMCH.docx
@@ -314,11 +314,15 @@
       <w:pPr>
         <w:pStyle w:val="BodyText"/>
         <w:rPr>
+          <w:b w:val="false"/>
+          <w:bCs w:val="false"/>
           <w:sz w:val="32"/>
         </w:rPr>
       </w:pPr>
       <w:r>
         <w:rPr>
+          <w:b w:val="false"/>
+          <w:bCs w:val="false"/>
           <w:sz w:val="32"/>
         </w:rPr>
       </w:r>
@@ -327,11 +331,15 @@
       <w:pPr>
         <w:pStyle w:val="BodyText"/>
         <w:rPr>
+          <w:b w:val="false"/>
+          <w:bCs w:val="false"/>
           <w:sz w:val="32"/>
         </w:rPr>
       </w:pPr>
       <w:r>
         <w:rPr>
+          <w:b w:val="false"/>
+          <w:bCs w:val="false"/>
           <w:sz w:val="32"/>
         </w:rPr>
       </w:r>
@@ -340,11 +348,15 @@
       <w:pPr>
         <w:pStyle w:val="BodyText"/>
         <w:rPr>
+          <w:b w:val="false"/>
+          <w:bCs w:val="false"/>
           <w:sz w:val="32"/>
         </w:rPr>
       </w:pPr>
       <w:r>
         <w:rPr>
+          <w:b w:val="false"/>
+          <w:bCs w:val="false"/>
           <w:sz w:val="32"/>
         </w:rPr>
       </w:r>
@@ -417,33 +429,6 @@
     <w:p>
       <w:pPr>
         <w:pStyle w:val="BodyText"/>
-        <w:rPr>
-          <w:sz w:val="32"/>
-        </w:rPr>
-      </w:pPr>
-      <w:r>
-        <w:rPr>
-          <w:sz w:val="32"/>
-        </w:rPr>
-      </w:r>
-    </w:p>
-    <w:p>
-      <w:pPr>
-        <w:pStyle w:val="BodyText"/>
-        <w:rPr>
-          <w:sz w:val="32"/>
-        </w:rPr>
-      </w:pPr>
-      <w:r>
-        <w:rPr>
-          <w:sz w:val="32"/>
-        </w:rPr>
-      </w:r>
-    </w:p>
-    <w:p>
-      <w:pPr>
-        <w:pStyle w:val="BodyText"/>
-        <w:spacing w:before="240" w:after="0"/>
         <w:rPr>
           <w:sz w:val="32"/>
         </w:rPr>
@@ -458,7 +443,7 @@
       <w:pPr>
         <w:pStyle w:val="Normal"/>
         <w:spacing w:lineRule="auto" w:line="276" w:before="0" w:after="0"/>
-        <w:ind w:firstLine="1157" w:left="7027" w:right="35"/>
+        <w:ind w:hanging="0" w:left="7027" w:right="35"/>
         <w:jc w:val="right"/>
         <w:rPr>
           <w:sz w:val="24"/>
@@ -519,6 +504,33 @@
           <w:sz w:val="24"/>
         </w:rPr>
         <w:t>HERNÁNDEZ</w:t>
+      </w:r>
+    </w:p>
+    <w:p>
+      <w:pPr>
+        <w:pStyle w:val="BodyText"/>
+        <w:rPr>
+          <w:b w:val="false"/>
+          <w:bCs w:val="false"/>
+          <w:sz w:val="32"/>
+        </w:rPr>
+      </w:pPr>
+      <w:r>
+        <w:rPr>
+          <w:b w:val="false"/>
+          <w:bCs w:val="false"/>
+          <w:spacing w:val="-2"/>
+          <w:sz w:val="24"/>
+        </w:rPr>
+        <w:tab/>
+        <w:tab/>
+        <w:tab/>
+        <w:tab/>
+        <w:tab/>
+        <w:tab/>
+        <w:tab/>
+        <w:tab/>
+        <w:t>JOSE MARÍA MAS CHICHARRO</w:t>
       </w:r>
     </w:p>
     <w:p>
@@ -7950,18 +7962,31 @@
           <w:bCs w:val="false"/>
         </w:rPr>
       </w:pPr>
-      <w:r>
-        <w:rPr>
-          <w:b w:val="false"/>
-          <w:bCs w:val="false"/>
-        </w:rPr>
-      </w:r>
+      <w:hyperlink r:id="rId25">
+        <w:r>
+          <w:rPr>
+            <w:rStyle w:val="Hyperlink"/>
+            <w:b w:val="false"/>
+            <w:bCs w:val="false"/>
+          </w:rPr>
+          <w:t>https://github.com/chemiufara/Ejercicios-cap-tulo-10-JMMCH-y-AMH</w:t>
+        </w:r>
+      </w:hyperlink>
+      <w:hyperlink r:id="rId26">
+        <w:r>
+          <w:rPr>
+            <w:b w:val="false"/>
+            <w:bCs w:val="false"/>
+          </w:rPr>
+          <w:t xml:space="preserve"> </w:t>
+        </w:r>
+      </w:hyperlink>
     </w:p>
     <w:sectPr>
-      <w:headerReference w:type="default" r:id="rId25"/>
-      <w:headerReference w:type="first" r:id="rId26"/>
-      <w:footerReference w:type="default" r:id="rId27"/>
-      <w:footerReference w:type="first" r:id="rId28"/>
+      <w:headerReference w:type="default" r:id="rId27"/>
+      <w:headerReference w:type="first" r:id="rId28"/>
+      <w:footerReference w:type="default" r:id="rId29"/>
+      <w:footerReference w:type="first" r:id="rId30"/>
       <w:type w:val="nextPage"/>
       <w:pgSz w:w="11906" w:h="16838"/>
       <w:pgMar w:left="1417" w:right="1417" w:gutter="0" w:header="480" w:top="1360" w:footer="810" w:bottom="1040"/>
@@ -11538,6 +11563,13 @@
       <w:rFonts w:ascii="Liberation Mono" w:hAnsi="Liberation Mono" w:eastAsia="Liberation Mono" w:cs="Liberation Mono"/>
     </w:rPr>
   </w:style>
+  <w:style w:type="character" w:styleId="FollowedHyperlink">
+    <w:name w:val="FollowedHyperlink"/>
+    <w:rPr>
+      <w:color w:val="800000"/>
+      <w:u w:val="single"/>
+    </w:rPr>
+  </w:style>
   <w:style w:type="paragraph" w:styleId="Ttulo">
     <w:name w:val="Título"/>
     <w:basedOn w:val="Normal"/>

</xml_diff>